<commit_message>
Adding the rest of the course work for DSE6211.
</commit_message>
<xml_diff>
--- a/Course_Project/Preliminary_Results/Preliminary_Results_RCW.docx
+++ b/Course_Project/Preliminary_Results/Preliminary_Results_RCW.docx
@@ -461,6 +461,7 @@
       <w:r>
         <w:tab/>
       </w:r>
+      <w:bookmarkStart w:id="1" w:name="_Hlk212302592"/>
       <w:r>
         <w:rPr>
           <w:rFonts w:ascii="Times New Roman" w:hAnsi="Times New Roman" w:cs="Times New Roman"/>
@@ -1211,6 +1212,7 @@
         <w:t xml:space="preserve"> only the arrival month. The intent of this feature is to capture seasonality in the data.</w:t>
       </w:r>
     </w:p>
+    <w:bookmarkEnd w:id="1"/>
     <w:p>
       <w:pPr>
         <w:rPr>
@@ -1231,7 +1233,7 @@
           <w:rFonts w:ascii="Times New Roman" w:hAnsi="Times New Roman" w:cs="Times New Roman"/>
         </w:rPr>
       </w:pPr>
-      <w:bookmarkStart w:id="1" w:name="_Toc210848799"/>
+      <w:bookmarkStart w:id="2" w:name="_Toc210848799"/>
       <w:r>
         <w:rPr>
           <w:rFonts w:ascii="Times New Roman" w:hAnsi="Times New Roman" w:cs="Times New Roman"/>
@@ -1239,7 +1241,7 @@
         <w:lastRenderedPageBreak/>
         <w:t>Model Implementation and Results</w:t>
       </w:r>
-      <w:bookmarkEnd w:id="1"/>
+      <w:bookmarkEnd w:id="2"/>
     </w:p>
     <w:p>
       <w:pPr>
@@ -3311,7 +3313,7 @@
           <w:rFonts w:ascii="Times New Roman" w:hAnsi="Times New Roman" w:cs="Times New Roman"/>
         </w:rPr>
       </w:pPr>
-      <w:bookmarkStart w:id="2" w:name="_Toc210848800"/>
+      <w:bookmarkStart w:id="3" w:name="_Toc210848800"/>
       <w:r>
         <w:rPr>
           <w:rFonts w:ascii="Times New Roman" w:hAnsi="Times New Roman" w:cs="Times New Roman"/>
@@ -3324,7 +3326,7 @@
         </w:rPr>
         <w:t>ecommendations for Phase 3</w:t>
       </w:r>
-      <w:bookmarkEnd w:id="2"/>
+      <w:bookmarkEnd w:id="3"/>
     </w:p>
     <w:p>
       <w:pPr>

</xml_diff>